<commit_message>
docs: align task 10 with task 9 and requirements
</commit_message>
<xml_diff>
--- a/docs/箱包MES日志及监控设计文档.docx
+++ b/docs/箱包MES日志及监控设计文档.docx
@@ -43,6 +43,320 @@
         <w:t>本设计面向箱包MES全流程追溯，记录业务操作、接口耗时与异常，支持按trace_id关联一次请求的业务日志和技术监控日志。设计遵循知识点4、5的分层监控、SLA基线、动态阈值思想，保证日志失败不影响业务主流程。</w:t>
       </w:r>
     </w:p>
+    <w:p>
+      <w:pPr>
+        <w:pStyle w:val="Heading2"/>
+      </w:pPr>
+      <w:r>
+        <w:rPr>
+          <w:color w:val="000000"/>
+        </w:rPr>
+        <w:t>1.1 与任务九和需求规格说明书的对接</w:t>
+      </w:r>
+    </w:p>
+    <w:p>
+      <w:r>
+        <w:t>任务九已经验证了OperationLogAspect记录业务操作、成功失败、操作人、请求摘要、结果摘要、耗时和traceId，TimeMonitorAspect记录排产等接口耗时。本任务将两类能力合并到可持久化的LogMonitorAspect：一次被标注的接口同时写入operation_log和api_monitor_log，避免操作日志与耗时日志分散在内存Store中。</w:t>
+      </w:r>
+    </w:p>
+    <w:p>
+      <w:r>
+        <w:t>需求规格说明书以订单—计划—工单—工序—批次为主线，要求计划、领料、报工、检验、外协、入库和追溯等关键写操作保留操作人、时间、工单/批次及关键业务数据。本项目将module、operation_name、request_uri、request_params、operator_id、created_at和trace_id作为统一审计入口，后续可在各业务Service方法上复用@LogMonitor。</w:t>
+      </w:r>
+    </w:p>
+    <w:tbl>
+      <w:tblPr>
+        <w:tblStyle w:val="TableGrid"/>
+        <w:tblW w:type="auto" w:w="0"/>
+        <w:jc w:val="center"/>
+        <w:tblLook w:firstColumn="1" w:firstRow="1" w:lastColumn="0" w:lastRow="0" w:noHBand="0" w:noVBand="1" w:val="04A0"/>
+      </w:tblPr>
+      <w:tblGrid>
+        <w:gridCol w:w="3360"/>
+        <w:gridCol w:w="3360"/>
+        <w:gridCol w:w="3360"/>
+      </w:tblGrid>
+      <w:tr>
+        <w:tc>
+          <w:tcPr>
+            <w:tcW w:type="dxa" w:w="3360"/>
+            <w:vAlign w:val="center"/>
+            <w:shd w:fill="FFFFFF"/>
+          </w:tcPr>
+          <w:p>
+            <w:r/>
+            <w:r>
+              <w:rPr>
+                <w:b/>
+                <w:color w:val="000000"/>
+                <w:sz w:val="18"/>
+              </w:rPr>
+              <w:t>任务九/需求概念</w:t>
+            </w:r>
+          </w:p>
+        </w:tc>
+        <w:tc>
+          <w:tcPr>
+            <w:tcW w:type="dxa" w:w="3360"/>
+            <w:vAlign w:val="center"/>
+            <w:shd w:fill="FFFFFF"/>
+          </w:tcPr>
+          <w:p>
+            <w:r/>
+            <w:r>
+              <w:rPr>
+                <w:b/>
+                <w:color w:val="000000"/>
+                <w:sz w:val="18"/>
+              </w:rPr>
+              <w:t>任务十落地位置</w:t>
+            </w:r>
+          </w:p>
+        </w:tc>
+        <w:tc>
+          <w:tcPr>
+            <w:tcW w:type="dxa" w:w="3360"/>
+            <w:vAlign w:val="center"/>
+            <w:shd w:fill="FFFFFF"/>
+          </w:tcPr>
+          <w:p>
+            <w:r/>
+            <w:r>
+              <w:rPr>
+                <w:b/>
+                <w:color w:val="000000"/>
+                <w:sz w:val="18"/>
+              </w:rPr>
+              <w:t>作用</w:t>
+            </w:r>
+          </w:p>
+        </w:tc>
+      </w:tr>
+      <w:tr>
+        <w:tc>
+          <w:tcPr>
+            <w:tcW w:type="dxa" w:w="3360"/>
+            <w:vAlign w:val="center"/>
+            <w:shd w:fill="FFFFFF"/>
+          </w:tcPr>
+          <w:p>
+            <w:r/>
+            <w:r>
+              <w:rPr>
+                <w:b w:val="0"/>
+                <w:color w:val="000000"/>
+                <w:sz w:val="18"/>
+              </w:rPr>
+              <w:t>OperationLogAspect</w:t>
+            </w:r>
+          </w:p>
+        </w:tc>
+        <w:tc>
+          <w:tcPr>
+            <w:tcW w:type="dxa" w:w="3360"/>
+            <w:vAlign w:val="center"/>
+            <w:shd w:fill="FFFFFF"/>
+          </w:tcPr>
+          <w:p>
+            <w:r/>
+            <w:r>
+              <w:rPr>
+                <w:b w:val="0"/>
+                <w:color w:val="000000"/>
+                <w:sz w:val="18"/>
+              </w:rPr>
+              <w:t>LogMonitorAspect → operation_log</w:t>
+            </w:r>
+          </w:p>
+        </w:tc>
+        <w:tc>
+          <w:tcPr>
+            <w:tcW w:type="dxa" w:w="3360"/>
+            <w:vAlign w:val="center"/>
+            <w:shd w:fill="FFFFFF"/>
+          </w:tcPr>
+          <w:p>
+            <w:r/>
+            <w:r>
+              <w:rPr>
+                <w:b w:val="0"/>
+                <w:color w:val="000000"/>
+                <w:sz w:val="18"/>
+              </w:rPr>
+              <w:t>记录业务操作、成功失败、异常摘要和请求参数</w:t>
+            </w:r>
+          </w:p>
+        </w:tc>
+      </w:tr>
+      <w:tr>
+        <w:tc>
+          <w:tcPr>
+            <w:tcW w:type="dxa" w:w="3360"/>
+            <w:vAlign w:val="center"/>
+            <w:shd w:fill="FFFFFF"/>
+          </w:tcPr>
+          <w:p>
+            <w:r/>
+            <w:r>
+              <w:rPr>
+                <w:b w:val="0"/>
+                <w:color w:val="000000"/>
+                <w:sz w:val="18"/>
+              </w:rPr>
+              <w:t>TimeMonitorAspect</w:t>
+            </w:r>
+          </w:p>
+        </w:tc>
+        <w:tc>
+          <w:tcPr>
+            <w:tcW w:type="dxa" w:w="3360"/>
+            <w:vAlign w:val="center"/>
+            <w:shd w:fill="FFFFFF"/>
+          </w:tcPr>
+          <w:p>
+            <w:r/>
+            <w:r>
+              <w:rPr>
+                <w:b w:val="0"/>
+                <w:color w:val="000000"/>
+                <w:sz w:val="18"/>
+              </w:rPr>
+              <w:t>LogMonitorAspect → api_monitor_log</w:t>
+            </w:r>
+          </w:p>
+        </w:tc>
+        <w:tc>
+          <w:tcPr>
+            <w:tcW w:type="dxa" w:w="3360"/>
+            <w:vAlign w:val="center"/>
+            <w:shd w:fill="FFFFFF"/>
+          </w:tcPr>
+          <w:p>
+            <w:r/>
+            <w:r>
+              <w:rPr>
+                <w:b w:val="0"/>
+                <w:color w:val="000000"/>
+                <w:sz w:val="18"/>
+              </w:rPr>
+              <w:t>记录状态码、duration_ms、slow_flag和异常类型</w:t>
+            </w:r>
+          </w:p>
+        </w:tc>
+      </w:tr>
+      <w:tr>
+        <w:tc>
+          <w:tcPr>
+            <w:tcW w:type="dxa" w:w="3360"/>
+            <w:vAlign w:val="center"/>
+            <w:shd w:fill="FFFFFF"/>
+          </w:tcPr>
+          <w:p>
+            <w:r/>
+            <w:r>
+              <w:rPr>
+                <w:b w:val="0"/>
+                <w:color w:val="000000"/>
+                <w:sz w:val="18"/>
+              </w:rPr>
+              <w:t>订单—工单—批次主线</w:t>
+            </w:r>
+          </w:p>
+        </w:tc>
+        <w:tc>
+          <w:tcPr>
+            <w:tcW w:type="dxa" w:w="3360"/>
+            <w:vAlign w:val="center"/>
+            <w:shd w:fill="FFFFFF"/>
+          </w:tcPr>
+          <w:p>
+            <w:r/>
+            <w:r>
+              <w:rPr>
+                <w:b w:val="0"/>
+                <w:color w:val="000000"/>
+                <w:sz w:val="18"/>
+              </w:rPr>
+              <w:t>work_order、production_report、trace_link</w:t>
+            </w:r>
+          </w:p>
+        </w:tc>
+        <w:tc>
+          <w:tcPr>
+            <w:tcW w:type="dxa" w:w="3360"/>
+            <w:vAlign w:val="center"/>
+            <w:shd w:fill="FFFFFF"/>
+          </w:tcPr>
+          <w:p>
+            <w:r/>
+            <w:r>
+              <w:rPr>
+                <w:b w:val="0"/>
+                <w:color w:val="000000"/>
+                <w:sz w:val="18"/>
+              </w:rPr>
+              <w:t>通过业务表和trace_id定位生产过程</w:t>
+            </w:r>
+          </w:p>
+        </w:tc>
+      </w:tr>
+      <w:tr>
+        <w:tc>
+          <w:tcPr>
+            <w:tcW w:type="dxa" w:w="3360"/>
+            <w:vAlign w:val="center"/>
+            <w:shd w:fill="FFFFFF"/>
+          </w:tcPr>
+          <w:p>
+            <w:r/>
+            <w:r>
+              <w:rPr>
+                <w:b w:val="0"/>
+                <w:color w:val="000000"/>
+                <w:sz w:val="18"/>
+              </w:rPr>
+              <w:t>统一响应 requestId</w:t>
+            </w:r>
+          </w:p>
+        </w:tc>
+        <w:tc>
+          <w:tcPr>
+            <w:tcW w:type="dxa" w:w="3360"/>
+            <w:vAlign w:val="center"/>
+            <w:shd w:fill="FFFFFF"/>
+          </w:tcPr>
+          <w:p>
+            <w:r/>
+            <w:r>
+              <w:rPr>
+                <w:b w:val="0"/>
+                <w:color w:val="000000"/>
+                <w:sz w:val="18"/>
+              </w:rPr>
+              <w:t>trace_id + 查询接口</w:t>
+            </w:r>
+          </w:p>
+        </w:tc>
+        <w:tc>
+          <w:tcPr>
+            <w:tcW w:type="dxa" w:w="3360"/>
+            <w:vAlign w:val="center"/>
+            <w:shd w:fill="FFFFFF"/>
+          </w:tcPr>
+          <w:p>
+            <w:r/>
+            <w:r>
+              <w:rPr>
+                <w:b w:val="0"/>
+                <w:color w:val="000000"/>
+                <w:sz w:val="18"/>
+              </w:rPr>
+              <w:t>用于日志定位和跨接口关联</w:t>
+            </w:r>
+          </w:p>
+        </w:tc>
+      </w:tr>
+    </w:tbl>
     <w:p>
       <w:pPr>
         <w:pStyle w:val="Heading1"/>

</xml_diff>